<commit_message>
Sumar las pantallas del maquetado y reemplazar el guion por el Canva
El punto 5 ahora incluye las 10 pantallas (5 Cliente, 5 Gestión); el
punto 6 remite a la presentación de Canva impresa en vez del guion con
tiempos.

Co-Authored-By: Claude Opus 5.5 <noreply@anthropic.com>
Claude-Session: https://claude.ai/code/session_01SSLGak5JhhQT61TFakHkGa
</commit_message>
<xml_diff>
--- a/Carpeta-de-Proyecto-V1-Dermalia.docx
+++ b/Carpeta-de-Proyecto-V1-Dermalia.docx
@@ -5524,7 +5524,7 @@
       <w:r>
         <w:t xml:space="preserve">Mockup de referencia con las pantallas de los dos apartados: </w:t>
       </w:r>
-      <w:hyperlink w:history="1" r:id="rIdqb-hea4gnx-ordky4zyry">
+      <w:hyperlink w:history="1" r:id="rIdyyx0verzklavbyt-tdfoa">
         <w:r>
           <w:rPr>
             <w:rStyle w:val="Hyperlink"/>
@@ -5532,6 +5532,674 @@
           <w:t xml:space="preserve">claude.ai/artifact/LAL3dVf5JWdd3SD7VYuRFX</w:t>
         </w:r>
       </w:hyperlink>
+    </w:p>
+    <w:p>
+      <w:pPr>
+        <w:pStyle w:val="Heading2"/>
+        <w:spacing w:after="140" w:before="260"/>
+      </w:pPr>
+      <w:r>
+        <w:t xml:space="preserve">Pantallas del apartado Cliente (terminal táctil)</w:t>
+      </w:r>
+    </w:p>
+    <w:p>
+      <w:pPr>
+        <w:spacing w:after="60" w:before="120"/>
+        <w:jc w:val="center"/>
+      </w:pPr>
+      <w:r>
+        <w:drawing>
+          <wp:inline distT="0" distB="0" distL="0" distR="0">
+            <wp:extent cx="5715000" cy="3705225"/>
+            <wp:effectExtent t="0" r="0" b="0" l="0"/>
+            <wp:docPr id="1" name="" descr="" title=""/>
+            <wp:cNvGraphicFramePr>
+              <a:graphicFrameLocks xmlns:a="http://schemas.openxmlformats.org/drawingml/2006/main" noChangeAspect="1"/>
+            </wp:cNvGraphicFramePr>
+            <a:graphic xmlns:a="http://schemas.openxmlformats.org/drawingml/2006/main">
+              <a:graphicData uri="http://schemas.openxmlformats.org/drawingml/2006/picture">
+                <pic:pic xmlns:pic="http://schemas.openxmlformats.org/drawingml/2006/picture">
+                  <pic:nvPicPr>
+                    <pic:cNvPr id="0" name="" descr=""/>
+                    <pic:cNvPicPr>
+                      <a:picLocks noChangeAspect="1" noChangeArrowheads="1"/>
+                    </pic:cNvPicPr>
+                  </pic:nvPicPr>
+                  <pic:blipFill>
+                    <a:blip r:embed="rId7" cstate="none"/>
+                    <a:srcRect/>
+                    <a:stretch>
+                      <a:fillRect/>
+                    </a:stretch>
+                  </pic:blipFill>
+                  <pic:spPr bwMode="auto">
+                    <a:xfrm>
+                      <a:off x="0" y="0"/>
+                      <a:ext cx="5715000" cy="3705225"/>
+                    </a:xfrm>
+                    <a:prstGeom prst="rect">
+                      <a:avLst/>
+                    </a:prstGeom>
+                  </pic:spPr>
+                </pic:pic>
+              </a:graphicData>
+            </a:graphic>
+          </wp:inline>
+        </w:drawing>
+      </w:r>
+    </w:p>
+    <w:p>
+      <w:pPr>
+        <w:spacing w:after="240"/>
+        <w:jc w:val="center"/>
+      </w:pPr>
+      <w:r>
+        <w:rPr>
+          <w:i/>
+          <w:iCs/>
+          <w:color w:val="555555"/>
+          <w:sz w:val="19"/>
+          <w:szCs w:val="19"/>
+        </w:rPr>
+        <w:t xml:space="preserve">Cliente 1 — Elegir protocolo (RF-01, RF-04)</w:t>
+      </w:r>
+    </w:p>
+    <w:p>
+      <w:pPr>
+        <w:spacing w:after="60" w:before="120"/>
+        <w:jc w:val="center"/>
+      </w:pPr>
+      <w:r>
+        <w:drawing>
+          <wp:inline distT="0" distB="0" distL="0" distR="0">
+            <wp:extent cx="5715000" cy="3257550"/>
+            <wp:effectExtent t="0" r="0" b="0" l="0"/>
+            <wp:docPr id="1" name="" descr="" title=""/>
+            <wp:cNvGraphicFramePr>
+              <a:graphicFrameLocks xmlns:a="http://schemas.openxmlformats.org/drawingml/2006/main" noChangeAspect="1"/>
+            </wp:cNvGraphicFramePr>
+            <a:graphic xmlns:a="http://schemas.openxmlformats.org/drawingml/2006/main">
+              <a:graphicData uri="http://schemas.openxmlformats.org/drawingml/2006/picture">
+                <pic:pic xmlns:pic="http://schemas.openxmlformats.org/drawingml/2006/picture">
+                  <pic:nvPicPr>
+                    <pic:cNvPr id="0" name="" descr=""/>
+                    <pic:cNvPicPr>
+                      <a:picLocks noChangeAspect="1" noChangeArrowheads="1"/>
+                    </pic:cNvPicPr>
+                  </pic:nvPicPr>
+                  <pic:blipFill>
+                    <a:blip r:embed="rId8" cstate="none"/>
+                    <a:srcRect/>
+                    <a:stretch>
+                      <a:fillRect/>
+                    </a:stretch>
+                  </pic:blipFill>
+                  <pic:spPr bwMode="auto">
+                    <a:xfrm>
+                      <a:off x="0" y="0"/>
+                      <a:ext cx="5715000" cy="3257550"/>
+                    </a:xfrm>
+                    <a:prstGeom prst="rect">
+                      <a:avLst/>
+                    </a:prstGeom>
+                  </pic:spPr>
+                </pic:pic>
+              </a:graphicData>
+            </a:graphic>
+          </wp:inline>
+        </w:drawing>
+      </w:r>
+    </w:p>
+    <w:p>
+      <w:pPr>
+        <w:spacing w:after="240"/>
+        <w:jc w:val="center"/>
+      </w:pPr>
+      <w:r>
+        <w:rPr>
+          <w:i/>
+          <w:iCs/>
+          <w:color w:val="555555"/>
+          <w:sz w:val="19"/>
+          <w:szCs w:val="19"/>
+        </w:rPr>
+        <w:t xml:space="preserve">Cliente 2 — Elegir horario (RF-01, RF-04)</w:t>
+      </w:r>
+    </w:p>
+    <w:p>
+      <w:r>
+        <w:br w:type="page"/>
+      </w:r>
+    </w:p>
+    <w:p>
+      <w:pPr>
+        <w:spacing w:after="60" w:before="120"/>
+        <w:jc w:val="center"/>
+      </w:pPr>
+      <w:r>
+        <w:drawing>
+          <wp:inline distT="0" distB="0" distL="0" distR="0">
+            <wp:extent cx="5715000" cy="3505200"/>
+            <wp:effectExtent t="0" r="0" b="0" l="0"/>
+            <wp:docPr id="1" name="" descr="" title=""/>
+            <wp:cNvGraphicFramePr>
+              <a:graphicFrameLocks xmlns:a="http://schemas.openxmlformats.org/drawingml/2006/main" noChangeAspect="1"/>
+            </wp:cNvGraphicFramePr>
+            <a:graphic xmlns:a="http://schemas.openxmlformats.org/drawingml/2006/main">
+              <a:graphicData uri="http://schemas.openxmlformats.org/drawingml/2006/picture">
+                <pic:pic xmlns:pic="http://schemas.openxmlformats.org/drawingml/2006/picture">
+                  <pic:nvPicPr>
+                    <pic:cNvPr id="0" name="" descr=""/>
+                    <pic:cNvPicPr>
+                      <a:picLocks noChangeAspect="1" noChangeArrowheads="1"/>
+                    </pic:cNvPicPr>
+                  </pic:nvPicPr>
+                  <pic:blipFill>
+                    <a:blip r:embed="rId9" cstate="none"/>
+                    <a:srcRect/>
+                    <a:stretch>
+                      <a:fillRect/>
+                    </a:stretch>
+                  </pic:blipFill>
+                  <pic:spPr bwMode="auto">
+                    <a:xfrm>
+                      <a:off x="0" y="0"/>
+                      <a:ext cx="5715000" cy="3505200"/>
+                    </a:xfrm>
+                    <a:prstGeom prst="rect">
+                      <a:avLst/>
+                    </a:prstGeom>
+                  </pic:spPr>
+                </pic:pic>
+              </a:graphicData>
+            </a:graphic>
+          </wp:inline>
+        </w:drawing>
+      </w:r>
+    </w:p>
+    <w:p>
+      <w:pPr>
+        <w:spacing w:after="240"/>
+        <w:jc w:val="center"/>
+      </w:pPr>
+      <w:r>
+        <w:rPr>
+          <w:i/>
+          <w:iCs/>
+          <w:color w:val="555555"/>
+          <w:sz w:val="19"/>
+          <w:szCs w:val="19"/>
+        </w:rPr>
+        <w:t xml:space="preserve">Cliente 3 — Confirmar turno y pagar seña (RF-01, RF-08, RF-10)</w:t>
+      </w:r>
+    </w:p>
+    <w:p>
+      <w:pPr>
+        <w:spacing w:after="60" w:before="120"/>
+        <w:jc w:val="center"/>
+      </w:pPr>
+      <w:r>
+        <w:drawing>
+          <wp:inline distT="0" distB="0" distL="0" distR="0">
+            <wp:extent cx="5715000" cy="3924300"/>
+            <wp:effectExtent t="0" r="0" b="0" l="0"/>
+            <wp:docPr id="1" name="" descr="" title=""/>
+            <wp:cNvGraphicFramePr>
+              <a:graphicFrameLocks xmlns:a="http://schemas.openxmlformats.org/drawingml/2006/main" noChangeAspect="1"/>
+            </wp:cNvGraphicFramePr>
+            <a:graphic xmlns:a="http://schemas.openxmlformats.org/drawingml/2006/main">
+              <a:graphicData uri="http://schemas.openxmlformats.org/drawingml/2006/picture">
+                <pic:pic xmlns:pic="http://schemas.openxmlformats.org/drawingml/2006/picture">
+                  <pic:nvPicPr>
+                    <pic:cNvPr id="0" name="" descr=""/>
+                    <pic:cNvPicPr>
+                      <a:picLocks noChangeAspect="1" noChangeArrowheads="1"/>
+                    </pic:cNvPicPr>
+                  </pic:nvPicPr>
+                  <pic:blipFill>
+                    <a:blip r:embed="rId10" cstate="none"/>
+                    <a:srcRect/>
+                    <a:stretch>
+                      <a:fillRect/>
+                    </a:stretch>
+                  </pic:blipFill>
+                  <pic:spPr bwMode="auto">
+                    <a:xfrm>
+                      <a:off x="0" y="0"/>
+                      <a:ext cx="5715000" cy="3924300"/>
+                    </a:xfrm>
+                    <a:prstGeom prst="rect">
+                      <a:avLst/>
+                    </a:prstGeom>
+                  </pic:spPr>
+                </pic:pic>
+              </a:graphicData>
+            </a:graphic>
+          </wp:inline>
+        </w:drawing>
+      </w:r>
+    </w:p>
+    <w:p>
+      <w:pPr>
+        <w:spacing w:after="240"/>
+        <w:jc w:val="center"/>
+      </w:pPr>
+      <w:r>
+        <w:rPr>
+          <w:i/>
+          <w:iCs/>
+          <w:color w:val="555555"/>
+          <w:sz w:val="19"/>
+          <w:szCs w:val="19"/>
+        </w:rPr>
+        <w:t xml:space="preserve">Cliente 4 — Buscador de precios y protocolos (RF-05, RF-07)</w:t>
+      </w:r>
+    </w:p>
+    <w:p>
+      <w:r>
+        <w:br w:type="page"/>
+      </w:r>
+    </w:p>
+    <w:p>
+      <w:pPr>
+        <w:spacing w:after="60" w:before="120"/>
+        <w:jc w:val="center"/>
+      </w:pPr>
+      <w:r>
+        <w:drawing>
+          <wp:inline distT="0" distB="0" distL="0" distR="0">
+            <wp:extent cx="5715000" cy="3257550"/>
+            <wp:effectExtent t="0" r="0" b="0" l="0"/>
+            <wp:docPr id="1" name="" descr="" title=""/>
+            <wp:cNvGraphicFramePr>
+              <a:graphicFrameLocks xmlns:a="http://schemas.openxmlformats.org/drawingml/2006/main" noChangeAspect="1"/>
+            </wp:cNvGraphicFramePr>
+            <a:graphic xmlns:a="http://schemas.openxmlformats.org/drawingml/2006/main">
+              <a:graphicData uri="http://schemas.openxmlformats.org/drawingml/2006/picture">
+                <pic:pic xmlns:pic="http://schemas.openxmlformats.org/drawingml/2006/picture">
+                  <pic:nvPicPr>
+                    <pic:cNvPr id="0" name="" descr=""/>
+                    <pic:cNvPicPr>
+                      <a:picLocks noChangeAspect="1" noChangeArrowheads="1"/>
+                    </pic:cNvPicPr>
+                  </pic:nvPicPr>
+                  <pic:blipFill>
+                    <a:blip r:embed="rId11" cstate="none"/>
+                    <a:srcRect/>
+                    <a:stretch>
+                      <a:fillRect/>
+                    </a:stretch>
+                  </pic:blipFill>
+                  <pic:spPr bwMode="auto">
+                    <a:xfrm>
+                      <a:off x="0" y="0"/>
+                      <a:ext cx="5715000" cy="3257550"/>
+                    </a:xfrm>
+                    <a:prstGeom prst="rect">
+                      <a:avLst/>
+                    </a:prstGeom>
+                  </pic:spPr>
+                </pic:pic>
+              </a:graphicData>
+            </a:graphic>
+          </wp:inline>
+        </w:drawing>
+      </w:r>
+    </w:p>
+    <w:p>
+      <w:pPr>
+        <w:spacing w:after="240"/>
+        <w:jc w:val="center"/>
+      </w:pPr>
+      <w:r>
+        <w:rPr>
+          <w:i/>
+          <w:iCs/>
+          <w:color w:val="555555"/>
+          <w:sz w:val="19"/>
+          <w:szCs w:val="19"/>
+        </w:rPr>
+        <w:t xml:space="preserve">Cliente 5 — Buscar mi turno (RF-12, RF-11)</w:t>
+      </w:r>
+    </w:p>
+    <w:p>
+      <w:r>
+        <w:br w:type="page"/>
+      </w:r>
+    </w:p>
+    <w:p>
+      <w:pPr>
+        <w:pStyle w:val="Heading2"/>
+        <w:spacing w:after="140" w:before="260"/>
+      </w:pPr>
+      <w:r>
+        <w:t xml:space="preserve">Pantallas del apartado Gestión (PC de recepción)</w:t>
+      </w:r>
+    </w:p>
+    <w:p>
+      <w:pPr>
+        <w:spacing w:after="60" w:before="120"/>
+        <w:jc w:val="center"/>
+      </w:pPr>
+      <w:r>
+        <w:drawing>
+          <wp:inline distT="0" distB="0" distL="0" distR="0">
+            <wp:extent cx="5715000" cy="3276600"/>
+            <wp:effectExtent t="0" r="0" b="0" l="0"/>
+            <wp:docPr id="1" name="" descr="" title=""/>
+            <wp:cNvGraphicFramePr>
+              <a:graphicFrameLocks xmlns:a="http://schemas.openxmlformats.org/drawingml/2006/main" noChangeAspect="1"/>
+            </wp:cNvGraphicFramePr>
+            <a:graphic xmlns:a="http://schemas.openxmlformats.org/drawingml/2006/main">
+              <a:graphicData uri="http://schemas.openxmlformats.org/drawingml/2006/picture">
+                <pic:pic xmlns:pic="http://schemas.openxmlformats.org/drawingml/2006/picture">
+                  <pic:nvPicPr>
+                    <pic:cNvPr id="0" name="" descr=""/>
+                    <pic:cNvPicPr>
+                      <a:picLocks noChangeAspect="1" noChangeArrowheads="1"/>
+                    </pic:cNvPicPr>
+                  </pic:nvPicPr>
+                  <pic:blipFill>
+                    <a:blip r:embed="rId12" cstate="none"/>
+                    <a:srcRect/>
+                    <a:stretch>
+                      <a:fillRect/>
+                    </a:stretch>
+                  </pic:blipFill>
+                  <pic:spPr bwMode="auto">
+                    <a:xfrm>
+                      <a:off x="0" y="0"/>
+                      <a:ext cx="5715000" cy="3276600"/>
+                    </a:xfrm>
+                    <a:prstGeom prst="rect">
+                      <a:avLst/>
+                    </a:prstGeom>
+                  </pic:spPr>
+                </pic:pic>
+              </a:graphicData>
+            </a:graphic>
+          </wp:inline>
+        </w:drawing>
+      </w:r>
+    </w:p>
+    <w:p>
+      <w:pPr>
+        <w:spacing w:after="240"/>
+        <w:jc w:val="center"/>
+      </w:pPr>
+      <w:r>
+        <w:rPr>
+          <w:i/>
+          <w:iCs/>
+          <w:color w:val="555555"/>
+          <w:sz w:val="19"/>
+          <w:szCs w:val="19"/>
+        </w:rPr>
+        <w:t xml:space="preserve">Gestión 1 — Cargar turno (RF-02, RF-04)</w:t>
+      </w:r>
+    </w:p>
+    <w:p>
+      <w:pPr>
+        <w:spacing w:after="60" w:before="120"/>
+        <w:jc w:val="center"/>
+      </w:pPr>
+      <w:r>
+        <w:drawing>
+          <wp:inline distT="0" distB="0" distL="0" distR="0">
+            <wp:extent cx="5715000" cy="3257550"/>
+            <wp:effectExtent t="0" r="0" b="0" l="0"/>
+            <wp:docPr id="1" name="" descr="" title=""/>
+            <wp:cNvGraphicFramePr>
+              <a:graphicFrameLocks xmlns:a="http://schemas.openxmlformats.org/drawingml/2006/main" noChangeAspect="1"/>
+            </wp:cNvGraphicFramePr>
+            <a:graphic xmlns:a="http://schemas.openxmlformats.org/drawingml/2006/main">
+              <a:graphicData uri="http://schemas.openxmlformats.org/drawingml/2006/picture">
+                <pic:pic xmlns:pic="http://schemas.openxmlformats.org/drawingml/2006/picture">
+                  <pic:nvPicPr>
+                    <pic:cNvPr id="0" name="" descr=""/>
+                    <pic:cNvPicPr>
+                      <a:picLocks noChangeAspect="1" noChangeArrowheads="1"/>
+                    </pic:cNvPicPr>
+                  </pic:nvPicPr>
+                  <pic:blipFill>
+                    <a:blip r:embed="rId13" cstate="none"/>
+                    <a:srcRect/>
+                    <a:stretch>
+                      <a:fillRect/>
+                    </a:stretch>
+                  </pic:blipFill>
+                  <pic:spPr bwMode="auto">
+                    <a:xfrm>
+                      <a:off x="0" y="0"/>
+                      <a:ext cx="5715000" cy="3257550"/>
+                    </a:xfrm>
+                    <a:prstGeom prst="rect">
+                      <a:avLst/>
+                    </a:prstGeom>
+                  </pic:spPr>
+                </pic:pic>
+              </a:graphicData>
+            </a:graphic>
+          </wp:inline>
+        </w:drawing>
+      </w:r>
+    </w:p>
+    <w:p>
+      <w:pPr>
+        <w:spacing w:after="240"/>
+        <w:jc w:val="center"/>
+      </w:pPr>
+      <w:r>
+        <w:rPr>
+          <w:i/>
+          <w:iCs/>
+          <w:color w:val="555555"/>
+          <w:sz w:val="19"/>
+          <w:szCs w:val="19"/>
+        </w:rPr>
+        <w:t xml:space="preserve">Gestión 2 — Elegir horario (RF-02, RF-04)</w:t>
+      </w:r>
+    </w:p>
+    <w:p>
+      <w:r>
+        <w:br w:type="page"/>
+      </w:r>
+    </w:p>
+    <w:p>
+      <w:pPr>
+        <w:spacing w:after="60" w:before="120"/>
+        <w:jc w:val="center"/>
+      </w:pPr>
+      <w:r>
+        <w:drawing>
+          <wp:inline distT="0" distB="0" distL="0" distR="0">
+            <wp:extent cx="5715000" cy="3257550"/>
+            <wp:effectExtent t="0" r="0" b="0" l="0"/>
+            <wp:docPr id="1" name="" descr="" title=""/>
+            <wp:cNvGraphicFramePr>
+              <a:graphicFrameLocks xmlns:a="http://schemas.openxmlformats.org/drawingml/2006/main" noChangeAspect="1"/>
+            </wp:cNvGraphicFramePr>
+            <a:graphic xmlns:a="http://schemas.openxmlformats.org/drawingml/2006/main">
+              <a:graphicData uri="http://schemas.openxmlformats.org/drawingml/2006/picture">
+                <pic:pic xmlns:pic="http://schemas.openxmlformats.org/drawingml/2006/picture">
+                  <pic:nvPicPr>
+                    <pic:cNvPr id="0" name="" descr=""/>
+                    <pic:cNvPicPr>
+                      <a:picLocks noChangeAspect="1" noChangeArrowheads="1"/>
+                    </pic:cNvPicPr>
+                  </pic:nvPicPr>
+                  <pic:blipFill>
+                    <a:blip r:embed="rId14" cstate="none"/>
+                    <a:srcRect/>
+                    <a:stretch>
+                      <a:fillRect/>
+                    </a:stretch>
+                  </pic:blipFill>
+                  <pic:spPr bwMode="auto">
+                    <a:xfrm>
+                      <a:off x="0" y="0"/>
+                      <a:ext cx="5715000" cy="3257550"/>
+                    </a:xfrm>
+                    <a:prstGeom prst="rect">
+                      <a:avLst/>
+                    </a:prstGeom>
+                  </pic:spPr>
+                </pic:pic>
+              </a:graphicData>
+            </a:graphic>
+          </wp:inline>
+        </w:drawing>
+      </w:r>
+    </w:p>
+    <w:p>
+      <w:pPr>
+        <w:spacing w:after="240"/>
+        <w:jc w:val="center"/>
+      </w:pPr>
+      <w:r>
+        <w:rPr>
+          <w:i/>
+          <w:iCs/>
+          <w:color w:val="555555"/>
+          <w:sz w:val="19"/>
+          <w:szCs w:val="19"/>
+        </w:rPr>
+        <w:t xml:space="preserve">Gestión 3 — Confirmar turno y registrar seña (RF-02, RF-09, RF-10)</w:t>
+      </w:r>
+    </w:p>
+    <w:p>
+      <w:pPr>
+        <w:spacing w:after="60" w:before="120"/>
+        <w:jc w:val="center"/>
+      </w:pPr>
+      <w:r>
+        <w:drawing>
+          <wp:inline distT="0" distB="0" distL="0" distR="0">
+            <wp:extent cx="5715000" cy="3638550"/>
+            <wp:effectExtent t="0" r="0" b="0" l="0"/>
+            <wp:docPr id="1" name="" descr="" title=""/>
+            <wp:cNvGraphicFramePr>
+              <a:graphicFrameLocks xmlns:a="http://schemas.openxmlformats.org/drawingml/2006/main" noChangeAspect="1"/>
+            </wp:cNvGraphicFramePr>
+            <a:graphic xmlns:a="http://schemas.openxmlformats.org/drawingml/2006/main">
+              <a:graphicData uri="http://schemas.openxmlformats.org/drawingml/2006/picture">
+                <pic:pic xmlns:pic="http://schemas.openxmlformats.org/drawingml/2006/picture">
+                  <pic:nvPicPr>
+                    <pic:cNvPr id="0" name="" descr=""/>
+                    <pic:cNvPicPr>
+                      <a:picLocks noChangeAspect="1" noChangeArrowheads="1"/>
+                    </pic:cNvPicPr>
+                  </pic:nvPicPr>
+                  <pic:blipFill>
+                    <a:blip r:embed="rId15" cstate="none"/>
+                    <a:srcRect/>
+                    <a:stretch>
+                      <a:fillRect/>
+                    </a:stretch>
+                  </pic:blipFill>
+                  <pic:spPr bwMode="auto">
+                    <a:xfrm>
+                      <a:off x="0" y="0"/>
+                      <a:ext cx="5715000" cy="3638550"/>
+                    </a:xfrm>
+                    <a:prstGeom prst="rect">
+                      <a:avLst/>
+                    </a:prstGeom>
+                  </pic:spPr>
+                </pic:pic>
+              </a:graphicData>
+            </a:graphic>
+          </wp:inline>
+        </w:drawing>
+      </w:r>
+    </w:p>
+    <w:p>
+      <w:pPr>
+        <w:spacing w:after="240"/>
+        <w:jc w:val="center"/>
+      </w:pPr>
+      <w:r>
+        <w:rPr>
+          <w:i/>
+          <w:iCs/>
+          <w:color w:val="555555"/>
+          <w:sz w:val="19"/>
+          <w:szCs w:val="19"/>
+        </w:rPr>
+        <w:t xml:space="preserve">Gestión 4 — Buscador de precios y protocolos (RF-06, RF-07)</w:t>
+      </w:r>
+    </w:p>
+    <w:p>
+      <w:r>
+        <w:br w:type="page"/>
+      </w:r>
+    </w:p>
+    <w:p>
+      <w:pPr>
+        <w:spacing w:after="60" w:before="120"/>
+        <w:jc w:val="center"/>
+      </w:pPr>
+      <w:r>
+        <w:drawing>
+          <wp:inline distT="0" distB="0" distL="0" distR="0">
+            <wp:extent cx="5715000" cy="3257550"/>
+            <wp:effectExtent t="0" r="0" b="0" l="0"/>
+            <wp:docPr id="1" name="" descr="" title=""/>
+            <wp:cNvGraphicFramePr>
+              <a:graphicFrameLocks xmlns:a="http://schemas.openxmlformats.org/drawingml/2006/main" noChangeAspect="1"/>
+            </wp:cNvGraphicFramePr>
+            <a:graphic xmlns:a="http://schemas.openxmlformats.org/drawingml/2006/main">
+              <a:graphicData uri="http://schemas.openxmlformats.org/drawingml/2006/picture">
+                <pic:pic xmlns:pic="http://schemas.openxmlformats.org/drawingml/2006/picture">
+                  <pic:nvPicPr>
+                    <pic:cNvPr id="0" name="" descr=""/>
+                    <pic:cNvPicPr>
+                      <a:picLocks noChangeAspect="1" noChangeArrowheads="1"/>
+                    </pic:cNvPicPr>
+                  </pic:nvPicPr>
+                  <pic:blipFill>
+                    <a:blip r:embed="rId16" cstate="none"/>
+                    <a:srcRect/>
+                    <a:stretch>
+                      <a:fillRect/>
+                    </a:stretch>
+                  </pic:blipFill>
+                  <pic:spPr bwMode="auto">
+                    <a:xfrm>
+                      <a:off x="0" y="0"/>
+                      <a:ext cx="5715000" cy="3257550"/>
+                    </a:xfrm>
+                    <a:prstGeom prst="rect">
+                      <a:avLst/>
+                    </a:prstGeom>
+                  </pic:spPr>
+                </pic:pic>
+              </a:graphicData>
+            </a:graphic>
+          </wp:inline>
+        </w:drawing>
+      </w:r>
+    </w:p>
+    <w:p>
+      <w:pPr>
+        <w:spacing w:after="240"/>
+        <w:jc w:val="center"/>
+      </w:pPr>
+      <w:r>
+        <w:rPr>
+          <w:i/>
+          <w:iCs/>
+          <w:color w:val="555555"/>
+          <w:sz w:val="19"/>
+          <w:szCs w:val="19"/>
+        </w:rPr>
+        <w:t xml:space="preserve">Gestión 5 — Buscar turnos (RF-13, RF-11)</w:t>
+      </w:r>
+    </w:p>
+    <w:p>
+      <w:r>
+        <w:br w:type="page"/>
+      </w:r>
     </w:p>
     <w:p>
       <w:pPr>
@@ -6809,7 +7477,7 @@
         <w:spacing w:after="160"/>
       </w:pPr>
       <w:r>
-        <w:t xml:space="preserve">Exposición oral de 9.5 minutos frente a la clase, defendiendo la propuesta: por qué este problema, por qué esta solución, por qué es viable. Roles del equipo: Santiago en Marco Lógico y coordinación, Bautista en requerimientos, Nicolás en diseño y maquetado, Clovis en el pitch.</w:t>
+        <w:t xml:space="preserve">El pitch se presenta con la presentación de Canva "Proyecto Informático 1" (11 diapositivas), que se adjunta impresa a continuación de esta página.</w:t>
       </w:r>
     </w:p>
     <w:p>
@@ -6818,1000 +7486,150 @@
         <w:spacing w:after="140" w:before="260"/>
       </w:pPr>
       <w:r>
-        <w:t xml:space="preserve">Guion por bloques</w:t>
-      </w:r>
-    </w:p>
-    <w:tbl>
-      <w:tblPr>
-        <w:tblW w:type="dxa" w:w="9350"/>
-        <w:tblBorders>
-          <w:top w:val="single" w:color="auto" w:sz="4"/>
-          <w:left w:val="single" w:color="auto" w:sz="4"/>
-          <w:bottom w:val="single" w:color="auto" w:sz="4"/>
-          <w:right w:val="single" w:color="auto" w:sz="4"/>
-          <w:insideH w:val="single" w:color="auto" w:sz="4"/>
-          <w:insideV w:val="single" w:color="auto" w:sz="4"/>
-        </w:tblBorders>
-      </w:tblPr>
-      <w:tblGrid>
-        <w:gridCol w:w="1350"/>
-        <w:gridCol w:w="1050"/>
-        <w:gridCol w:w="1150"/>
-        <w:gridCol w:w="5800"/>
-      </w:tblGrid>
-      <w:tr>
-        <w:trPr>
-          <w:tblHeader/>
-        </w:trPr>
-        <w:tc>
-          <w:tcPr>
-            <w:tcW w:type="dxa" w:w="1350"/>
-            <w:shd w:fill="004d4d" w:color="auto" w:val="clear"/>
-            <w:tcMar>
-              <w:top w:type="dxa" w:w="80"/>
-              <w:left w:type="dxa" w:w="100"/>
-              <w:bottom w:type="dxa" w:w="80"/>
-              <w:right w:type="dxa" w:w="100"/>
-            </w:tcMar>
-          </w:tcPr>
-          <w:p>
-            <w:r>
-              <w:rPr>
-                <w:b/>
-                <w:bCs/>
-                <w:color w:val="FFFFFF"/>
-                <w:sz w:val="19"/>
-                <w:szCs w:val="19"/>
-              </w:rPr>
-              <w:t xml:space="preserve">Bloque</w:t>
-            </w:r>
-          </w:p>
-        </w:tc>
-        <w:tc>
-          <w:tcPr>
-            <w:tcW w:type="dxa" w:w="1050"/>
-            <w:shd w:fill="004d4d" w:color="auto" w:val="clear"/>
-            <w:tcMar>
-              <w:top w:type="dxa" w:w="80"/>
-              <w:left w:type="dxa" w:w="100"/>
-              <w:bottom w:type="dxa" w:w="80"/>
-              <w:right w:type="dxa" w:w="100"/>
-            </w:tcMar>
-          </w:tcPr>
-          <w:p>
-            <w:r>
-              <w:rPr>
-                <w:b/>
-                <w:bCs/>
-                <w:color w:val="FFFFFF"/>
-                <w:sz w:val="19"/>
-                <w:szCs w:val="19"/>
-              </w:rPr>
-              <w:t xml:space="preserve">Tiempo</w:t>
-            </w:r>
-          </w:p>
-        </w:tc>
-        <w:tc>
-          <w:tcPr>
-            <w:tcW w:type="dxa" w:w="1150"/>
-            <w:shd w:fill="004d4d" w:color="auto" w:val="clear"/>
-            <w:tcMar>
-              <w:top w:type="dxa" w:w="80"/>
-              <w:left w:type="dxa" w:w="100"/>
-              <w:bottom w:type="dxa" w:w="80"/>
-              <w:right w:type="dxa" w:w="100"/>
-            </w:tcMar>
-          </w:tcPr>
-          <w:p>
-            <w:r>
-              <w:rPr>
-                <w:b/>
-                <w:bCs/>
-                <w:color w:val="FFFFFF"/>
-                <w:sz w:val="19"/>
-                <w:szCs w:val="19"/>
-              </w:rPr>
-              <w:t xml:space="preserve">Habla</w:t>
-            </w:r>
-          </w:p>
-        </w:tc>
-        <w:tc>
-          <w:tcPr>
-            <w:tcW w:type="dxa" w:w="5800"/>
-            <w:shd w:fill="004d4d" w:color="auto" w:val="clear"/>
-            <w:tcMar>
-              <w:top w:type="dxa" w:w="80"/>
-              <w:left w:type="dxa" w:w="100"/>
-              <w:bottom w:type="dxa" w:w="80"/>
-              <w:right w:type="dxa" w:w="100"/>
-            </w:tcMar>
-          </w:tcPr>
-          <w:p>
-            <w:r>
-              <w:rPr>
-                <w:b/>
-                <w:bCs/>
-                <w:color w:val="FFFFFF"/>
-                <w:sz w:val="19"/>
-                <w:szCs w:val="19"/>
-              </w:rPr>
-              <w:t xml:space="preserve">Contenido</w:t>
-            </w:r>
-          </w:p>
-        </w:tc>
-      </w:tr>
-      <w:tr>
-        <w:tc>
-          <w:tcPr>
-            <w:tcW w:type="dxa" w:w="1350"/>
-            <w:tcMar>
-              <w:top w:type="dxa" w:w="80"/>
-              <w:left w:type="dxa" w:w="100"/>
-              <w:bottom w:type="dxa" w:w="80"/>
-              <w:right w:type="dxa" w:w="100"/>
-            </w:tcMar>
-          </w:tcPr>
-          <w:p>
-            <w:r>
-              <w:rPr>
-                <w:b w:val="false"/>
-                <w:bCs w:val="false"/>
-                <w:sz w:val="19"/>
-                <w:szCs w:val="19"/>
-              </w:rPr>
-              <w:t xml:space="preserve">Gancho</w:t>
-            </w:r>
-          </w:p>
-        </w:tc>
-        <w:tc>
-          <w:tcPr>
-            <w:tcW w:type="dxa" w:w="1050"/>
-            <w:tcMar>
-              <w:top w:type="dxa" w:w="80"/>
-              <w:left w:type="dxa" w:w="100"/>
-              <w:bottom w:type="dxa" w:w="80"/>
-              <w:right w:type="dxa" w:w="100"/>
-            </w:tcMar>
-          </w:tcPr>
-          <w:p>
-            <w:r>
-              <w:rPr>
-                <w:b w:val="false"/>
-                <w:bCs w:val="false"/>
-                <w:sz w:val="19"/>
-                <w:szCs w:val="19"/>
-              </w:rPr>
-              <w:t xml:space="preserve">1.75 min</w:t>
-            </w:r>
-          </w:p>
-        </w:tc>
-        <w:tc>
-          <w:tcPr>
-            <w:tcW w:type="dxa" w:w="1150"/>
-            <w:tcMar>
-              <w:top w:type="dxa" w:w="80"/>
-              <w:left w:type="dxa" w:w="100"/>
-              <w:bottom w:type="dxa" w:w="80"/>
-              <w:right w:type="dxa" w:w="100"/>
-            </w:tcMar>
-          </w:tcPr>
-          <w:p>
-            <w:r>
-              <w:rPr>
-                <w:b w:val="false"/>
-                <w:bCs w:val="false"/>
-                <w:sz w:val="19"/>
-                <w:szCs w:val="19"/>
-              </w:rPr>
-              <w:t xml:space="preserve">Clovis</w:t>
-            </w:r>
-          </w:p>
-        </w:tc>
-        <w:tc>
-          <w:tcPr>
-            <w:tcW w:type="dxa" w:w="5800"/>
-            <w:tcMar>
-              <w:top w:type="dxa" w:w="80"/>
-              <w:left w:type="dxa" w:w="100"/>
-              <w:bottom w:type="dxa" w:w="80"/>
-              <w:right w:type="dxa" w:w="100"/>
-            </w:tcMar>
-          </w:tcPr>
-          <w:p>
-            <w:r>
-              <w:rPr>
-                <w:b w:val="false"/>
-                <w:bCs w:val="false"/>
-                <w:sz w:val="19"/>
-                <w:szCs w:val="19"/>
-              </w:rPr>
-              <w:t xml:space="preserve">Dermalia pierde 312 turnos al año por inasistencia ($6.240.000 anuales), y su recepción dedica casi 500 horas al año a responder las mismas consultas repetidas por WhatsApp.</w:t>
-            </w:r>
-          </w:p>
-        </w:tc>
-      </w:tr>
-      <w:tr>
-        <w:tc>
-          <w:tcPr>
-            <w:tcW w:type="dxa" w:w="1350"/>
-            <w:shd w:fill="E8EEEE" w:color="auto" w:val="clear"/>
-            <w:tcMar>
-              <w:top w:type="dxa" w:w="80"/>
-              <w:left w:type="dxa" w:w="100"/>
-              <w:bottom w:type="dxa" w:w="80"/>
-              <w:right w:type="dxa" w:w="100"/>
-            </w:tcMar>
-          </w:tcPr>
-          <w:p>
-            <w:r>
-              <w:rPr>
-                <w:b w:val="false"/>
-                <w:bCs w:val="false"/>
-                <w:sz w:val="19"/>
-                <w:szCs w:val="19"/>
-              </w:rPr>
-              <w:t xml:space="preserve">Problema</w:t>
-            </w:r>
-          </w:p>
-        </w:tc>
-        <w:tc>
-          <w:tcPr>
-            <w:tcW w:type="dxa" w:w="1050"/>
-            <w:shd w:fill="E8EEEE" w:color="auto" w:val="clear"/>
-            <w:tcMar>
-              <w:top w:type="dxa" w:w="80"/>
-              <w:left w:type="dxa" w:w="100"/>
-              <w:bottom w:type="dxa" w:w="80"/>
-              <w:right w:type="dxa" w:w="100"/>
-            </w:tcMar>
-          </w:tcPr>
-          <w:p>
-            <w:r>
-              <w:rPr>
-                <w:b w:val="false"/>
-                <w:bCs w:val="false"/>
-                <w:sz w:val="19"/>
-                <w:szCs w:val="19"/>
-              </w:rPr>
-              <w:t xml:space="preserve">1.5 min</w:t>
-            </w:r>
-          </w:p>
-        </w:tc>
-        <w:tc>
-          <w:tcPr>
-            <w:tcW w:type="dxa" w:w="1150"/>
-            <w:shd w:fill="E8EEEE" w:color="auto" w:val="clear"/>
-            <w:tcMar>
-              <w:top w:type="dxa" w:w="80"/>
-              <w:left w:type="dxa" w:w="100"/>
-              <w:bottom w:type="dxa" w:w="80"/>
-              <w:right w:type="dxa" w:w="100"/>
-            </w:tcMar>
-          </w:tcPr>
-          <w:p>
-            <w:r>
-              <w:rPr>
-                <w:b w:val="false"/>
-                <w:bCs w:val="false"/>
-                <w:sz w:val="19"/>
-                <w:szCs w:val="19"/>
-              </w:rPr>
-              <w:t xml:space="preserve">Santiago</w:t>
-            </w:r>
-          </w:p>
-        </w:tc>
-        <w:tc>
-          <w:tcPr>
-            <w:tcW w:type="dxa" w:w="5800"/>
-            <w:shd w:fill="E8EEEE" w:color="auto" w:val="clear"/>
-            <w:tcMar>
-              <w:top w:type="dxa" w:w="80"/>
-              <w:left w:type="dxa" w:w="100"/>
-              <w:bottom w:type="dxa" w:w="80"/>
-              <w:right w:type="dxa" w:w="100"/>
-            </w:tcMar>
-          </w:tcPr>
-          <w:p>
-            <w:r>
-              <w:rPr>
-                <w:b w:val="false"/>
-                <w:bCs w:val="false"/>
-                <w:sz w:val="19"/>
-                <w:szCs w:val="19"/>
-              </w:rPr>
-              <w:t xml:space="preserve">El problema central: la gestión de turnos depende de la atención manual de la recepción por WhatsApp, y sus tres causas directas.</w:t>
-            </w:r>
-          </w:p>
-        </w:tc>
-      </w:tr>
-      <w:tr>
-        <w:tc>
-          <w:tcPr>
-            <w:tcW w:type="dxa" w:w="1350"/>
-            <w:tcMar>
-              <w:top w:type="dxa" w:w="80"/>
-              <w:left w:type="dxa" w:w="100"/>
-              <w:bottom w:type="dxa" w:w="80"/>
-              <w:right w:type="dxa" w:w="100"/>
-            </w:tcMar>
-          </w:tcPr>
-          <w:p>
-            <w:r>
-              <w:rPr>
-                <w:b w:val="false"/>
-                <w:bCs w:val="false"/>
-                <w:sz w:val="19"/>
-                <w:szCs w:val="19"/>
-              </w:rPr>
-              <w:t xml:space="preserve">Propuesta</w:t>
-            </w:r>
-          </w:p>
-        </w:tc>
-        <w:tc>
-          <w:tcPr>
-            <w:tcW w:type="dxa" w:w="1050"/>
-            <w:tcMar>
-              <w:top w:type="dxa" w:w="80"/>
-              <w:left w:type="dxa" w:w="100"/>
-              <w:bottom w:type="dxa" w:w="80"/>
-              <w:right w:type="dxa" w:w="100"/>
-            </w:tcMar>
-          </w:tcPr>
-          <w:p>
-            <w:r>
-              <w:rPr>
-                <w:b w:val="false"/>
-                <w:bCs w:val="false"/>
-                <w:sz w:val="19"/>
-                <w:szCs w:val="19"/>
-              </w:rPr>
-              <w:t xml:space="preserve">1.5 min</w:t>
-            </w:r>
-          </w:p>
-        </w:tc>
-        <w:tc>
-          <w:tcPr>
-            <w:tcW w:type="dxa" w:w="1150"/>
-            <w:tcMar>
-              <w:top w:type="dxa" w:w="80"/>
-              <w:left w:type="dxa" w:w="100"/>
-              <w:bottom w:type="dxa" w:w="80"/>
-              <w:right w:type="dxa" w:w="100"/>
-            </w:tcMar>
-          </w:tcPr>
-          <w:p>
-            <w:r>
-              <w:rPr>
-                <w:b w:val="false"/>
-                <w:bCs w:val="false"/>
-                <w:sz w:val="19"/>
-                <w:szCs w:val="19"/>
-              </w:rPr>
-              <w:t xml:space="preserve">Bautista</w:t>
-            </w:r>
-          </w:p>
-        </w:tc>
-        <w:tc>
-          <w:tcPr>
-            <w:tcW w:type="dxa" w:w="5800"/>
-            <w:tcMar>
-              <w:top w:type="dxa" w:w="80"/>
-              <w:left w:type="dxa" w:w="100"/>
-              <w:bottom w:type="dxa" w:w="80"/>
-              <w:right w:type="dxa" w:w="100"/>
-            </w:tcMar>
-          </w:tcPr>
-          <w:p>
-            <w:r>
-              <w:rPr>
-                <w:b w:val="false"/>
-                <w:bCs w:val="false"/>
-                <w:sz w:val="19"/>
-                <w:szCs w:val="19"/>
-              </w:rPr>
-              <w:t xml:space="preserve">Objetivo general: automatizar la carga de turnos, el registro de seña y las respuestas frecuentes, en dos apartados (terminal y recepción).</w:t>
-            </w:r>
-          </w:p>
-        </w:tc>
-      </w:tr>
-      <w:tr>
-        <w:tc>
-          <w:tcPr>
-            <w:tcW w:type="dxa" w:w="1350"/>
-            <w:shd w:fill="E8EEEE" w:color="auto" w:val="clear"/>
-            <w:tcMar>
-              <w:top w:type="dxa" w:w="80"/>
-              <w:left w:type="dxa" w:w="100"/>
-              <w:bottom w:type="dxa" w:w="80"/>
-              <w:right w:type="dxa" w:w="100"/>
-            </w:tcMar>
-          </w:tcPr>
-          <w:p>
-            <w:r>
-              <w:rPr>
-                <w:b w:val="false"/>
-                <w:bCs w:val="false"/>
-                <w:sz w:val="19"/>
-                <w:szCs w:val="19"/>
-              </w:rPr>
-              <w:t xml:space="preserve">Demostración</w:t>
-            </w:r>
-          </w:p>
-        </w:tc>
-        <w:tc>
-          <w:tcPr>
-            <w:tcW w:type="dxa" w:w="1050"/>
-            <w:shd w:fill="E8EEEE" w:color="auto" w:val="clear"/>
-            <w:tcMar>
-              <w:top w:type="dxa" w:w="80"/>
-              <w:left w:type="dxa" w:w="100"/>
-              <w:bottom w:type="dxa" w:w="80"/>
-              <w:right w:type="dxa" w:w="100"/>
-            </w:tcMar>
-          </w:tcPr>
-          <w:p>
-            <w:r>
-              <w:rPr>
-                <w:b w:val="false"/>
-                <w:bCs w:val="false"/>
-                <w:sz w:val="19"/>
-                <w:szCs w:val="19"/>
-              </w:rPr>
-              <w:t xml:space="preserve">1.75 min</w:t>
-            </w:r>
-          </w:p>
-        </w:tc>
-        <w:tc>
-          <w:tcPr>
-            <w:tcW w:type="dxa" w:w="1150"/>
-            <w:shd w:fill="E8EEEE" w:color="auto" w:val="clear"/>
-            <w:tcMar>
-              <w:top w:type="dxa" w:w="80"/>
-              <w:left w:type="dxa" w:w="100"/>
-              <w:bottom w:type="dxa" w:w="80"/>
-              <w:right w:type="dxa" w:w="100"/>
-            </w:tcMar>
-          </w:tcPr>
-          <w:p>
-            <w:r>
-              <w:rPr>
-                <w:b w:val="false"/>
-                <w:bCs w:val="false"/>
-                <w:sz w:val="19"/>
-                <w:szCs w:val="19"/>
-              </w:rPr>
-              <w:t xml:space="preserve">Nicolás</w:t>
-            </w:r>
-          </w:p>
-        </w:tc>
-        <w:tc>
-          <w:tcPr>
-            <w:tcW w:type="dxa" w:w="5800"/>
-            <w:shd w:fill="E8EEEE" w:color="auto" w:val="clear"/>
-            <w:tcMar>
-              <w:top w:type="dxa" w:w="80"/>
-              <w:left w:type="dxa" w:w="100"/>
-              <w:bottom w:type="dxa" w:w="80"/>
-              <w:right w:type="dxa" w:w="100"/>
-            </w:tcMar>
-          </w:tcPr>
-          <w:p>
-            <w:r>
-              <w:rPr>
-                <w:b w:val="false"/>
-                <w:bCs w:val="false"/>
-                <w:sz w:val="19"/>
-                <w:szCs w:val="19"/>
-              </w:rPr>
-              <w:t xml:space="preserve">Recorrido de los dos apartados en el maquetado, de punta a punta.</w:t>
-            </w:r>
-          </w:p>
-        </w:tc>
-      </w:tr>
-      <w:tr>
-        <w:tc>
-          <w:tcPr>
-            <w:tcW w:type="dxa" w:w="1350"/>
-            <w:tcMar>
-              <w:top w:type="dxa" w:w="80"/>
-              <w:left w:type="dxa" w:w="100"/>
-              <w:bottom w:type="dxa" w:w="80"/>
-              <w:right w:type="dxa" w:w="100"/>
-            </w:tcMar>
-          </w:tcPr>
-          <w:p>
-            <w:r>
-              <w:rPr>
-                <w:b w:val="false"/>
-                <w:bCs w:val="false"/>
-                <w:sz w:val="19"/>
-                <w:szCs w:val="19"/>
-              </w:rPr>
-              <w:t xml:space="preserve">Transición</w:t>
-            </w:r>
-          </w:p>
-        </w:tc>
-        <w:tc>
-          <w:tcPr>
-            <w:tcW w:type="dxa" w:w="1050"/>
-            <w:tcMar>
-              <w:top w:type="dxa" w:w="80"/>
-              <w:left w:type="dxa" w:w="100"/>
-              <w:bottom w:type="dxa" w:w="80"/>
-              <w:right w:type="dxa" w:w="100"/>
-            </w:tcMar>
-          </w:tcPr>
-          <w:p>
-            <w:r>
-              <w:rPr>
-                <w:b w:val="false"/>
-                <w:bCs w:val="false"/>
-                <w:sz w:val="19"/>
-                <w:szCs w:val="19"/>
-              </w:rPr>
-              <w:t xml:space="preserve">0.5 min</w:t>
-            </w:r>
-          </w:p>
-        </w:tc>
-        <w:tc>
-          <w:tcPr>
-            <w:tcW w:type="dxa" w:w="1150"/>
-            <w:tcMar>
-              <w:top w:type="dxa" w:w="80"/>
-              <w:left w:type="dxa" w:w="100"/>
-              <w:bottom w:type="dxa" w:w="80"/>
-              <w:right w:type="dxa" w:w="100"/>
-            </w:tcMar>
-          </w:tcPr>
-          <w:p>
-            <w:r>
-              <w:rPr>
-                <w:b w:val="false"/>
-                <w:bCs w:val="false"/>
-                <w:sz w:val="19"/>
-                <w:szCs w:val="19"/>
-              </w:rPr>
-              <w:t xml:space="preserve">Santiago</w:t>
-            </w:r>
-          </w:p>
-        </w:tc>
-        <w:tc>
-          <w:tcPr>
-            <w:tcW w:type="dxa" w:w="5800"/>
-            <w:tcMar>
-              <w:top w:type="dxa" w:w="80"/>
-              <w:left w:type="dxa" w:w="100"/>
-              <w:bottom w:type="dxa" w:w="80"/>
-              <w:right w:type="dxa" w:w="100"/>
-            </w:tcMar>
-          </w:tcPr>
-          <w:p>
-            <w:r>
-              <w:rPr>
-                <w:b w:val="false"/>
-                <w:bCs w:val="false"/>
-                <w:sz w:val="19"/>
-                <w:szCs w:val="19"/>
-              </w:rPr>
-              <w:t xml:space="preserve">Stack técnico: C con SQL Server, Qt de escritorio, sin API externa.</w:t>
-            </w:r>
-          </w:p>
-        </w:tc>
-      </w:tr>
-      <w:tr>
-        <w:tc>
-          <w:tcPr>
-            <w:tcW w:type="dxa" w:w="1350"/>
-            <w:shd w:fill="E8EEEE" w:color="auto" w:val="clear"/>
-            <w:tcMar>
-              <w:top w:type="dxa" w:w="80"/>
-              <w:left w:type="dxa" w:w="100"/>
-              <w:bottom w:type="dxa" w:w="80"/>
-              <w:right w:type="dxa" w:w="100"/>
-            </w:tcMar>
-          </w:tcPr>
-          <w:p>
-            <w:r>
-              <w:rPr>
-                <w:b w:val="false"/>
-                <w:bCs w:val="false"/>
-                <w:sz w:val="19"/>
-                <w:szCs w:val="19"/>
-              </w:rPr>
-              <w:t xml:space="preserve">Viabilidad</w:t>
-            </w:r>
-          </w:p>
-        </w:tc>
-        <w:tc>
-          <w:tcPr>
-            <w:tcW w:type="dxa" w:w="1050"/>
-            <w:shd w:fill="E8EEEE" w:color="auto" w:val="clear"/>
-            <w:tcMar>
-              <w:top w:type="dxa" w:w="80"/>
-              <w:left w:type="dxa" w:w="100"/>
-              <w:bottom w:type="dxa" w:w="80"/>
-              <w:right w:type="dxa" w:w="100"/>
-            </w:tcMar>
-          </w:tcPr>
-          <w:p>
-            <w:r>
-              <w:rPr>
-                <w:b w:val="false"/>
-                <w:bCs w:val="false"/>
-                <w:sz w:val="19"/>
-                <w:szCs w:val="19"/>
-              </w:rPr>
-              <w:t xml:space="preserve">1.5 min</w:t>
-            </w:r>
-          </w:p>
-        </w:tc>
-        <w:tc>
-          <w:tcPr>
-            <w:tcW w:type="dxa" w:w="1150"/>
-            <w:shd w:fill="E8EEEE" w:color="auto" w:val="clear"/>
-            <w:tcMar>
-              <w:top w:type="dxa" w:w="80"/>
-              <w:left w:type="dxa" w:w="100"/>
-              <w:bottom w:type="dxa" w:w="80"/>
-              <w:right w:type="dxa" w:w="100"/>
-            </w:tcMar>
-          </w:tcPr>
-          <w:p>
-            <w:r>
-              <w:rPr>
-                <w:b w:val="false"/>
-                <w:bCs w:val="false"/>
-                <w:sz w:val="19"/>
-                <w:szCs w:val="19"/>
-              </w:rPr>
-              <w:t xml:space="preserve">Bautista</w:t>
-            </w:r>
-          </w:p>
-        </w:tc>
-        <w:tc>
-          <w:tcPr>
-            <w:tcW w:type="dxa" w:w="5800"/>
-            <w:shd w:fill="E8EEEE" w:color="auto" w:val="clear"/>
-            <w:tcMar>
-              <w:top w:type="dxa" w:w="80"/>
-              <w:left w:type="dxa" w:w="100"/>
-              <w:bottom w:type="dxa" w:w="80"/>
-              <w:right w:type="dxa" w:w="100"/>
-            </w:tcMar>
-          </w:tcPr>
-          <w:p>
-            <w:r>
-              <w:rPr>
-                <w:b w:val="false"/>
-                <w:bCs w:val="false"/>
-                <w:sz w:val="19"/>
-                <w:szCs w:val="19"/>
-              </w:rPr>
-              <w:t xml:space="preserve">Los cuatro indicadores de éxito, medidos a las 4 semanas de uso.</w:t>
-            </w:r>
-          </w:p>
-        </w:tc>
-      </w:tr>
-      <w:tr>
-        <w:tc>
-          <w:tcPr>
-            <w:tcW w:type="dxa" w:w="1350"/>
-            <w:tcMar>
-              <w:top w:type="dxa" w:w="80"/>
-              <w:left w:type="dxa" w:w="100"/>
-              <w:bottom w:type="dxa" w:w="80"/>
-              <w:right w:type="dxa" w:w="100"/>
-            </w:tcMar>
-          </w:tcPr>
-          <w:p>
-            <w:r>
-              <w:rPr>
-                <w:b w:val="false"/>
-                <w:bCs w:val="false"/>
-                <w:sz w:val="19"/>
-                <w:szCs w:val="19"/>
-              </w:rPr>
-              <w:t xml:space="preserve">Recorrido</w:t>
-            </w:r>
-          </w:p>
-        </w:tc>
-        <w:tc>
-          <w:tcPr>
-            <w:tcW w:type="dxa" w:w="1050"/>
-            <w:tcMar>
-              <w:top w:type="dxa" w:w="80"/>
-              <w:left w:type="dxa" w:w="100"/>
-              <w:bottom w:type="dxa" w:w="80"/>
-              <w:right w:type="dxa" w:w="100"/>
-            </w:tcMar>
-          </w:tcPr>
-          <w:p>
-            <w:r>
-              <w:rPr>
-                <w:b w:val="false"/>
-                <w:bCs w:val="false"/>
-                <w:sz w:val="19"/>
-                <w:szCs w:val="19"/>
-              </w:rPr>
-              <w:t xml:space="preserve">0.5 min</w:t>
-            </w:r>
-          </w:p>
-        </w:tc>
-        <w:tc>
-          <w:tcPr>
-            <w:tcW w:type="dxa" w:w="1150"/>
-            <w:tcMar>
-              <w:top w:type="dxa" w:w="80"/>
-              <w:left w:type="dxa" w:w="100"/>
-              <w:bottom w:type="dxa" w:w="80"/>
-              <w:right w:type="dxa" w:w="100"/>
-            </w:tcMar>
-          </w:tcPr>
-          <w:p>
-            <w:r>
-              <w:rPr>
-                <w:b w:val="false"/>
-                <w:bCs w:val="false"/>
-                <w:sz w:val="19"/>
-                <w:szCs w:val="19"/>
-              </w:rPr>
-              <w:t xml:space="preserve">Santiago</w:t>
-            </w:r>
-          </w:p>
-        </w:tc>
-        <w:tc>
-          <w:tcPr>
-            <w:tcW w:type="dxa" w:w="5800"/>
-            <w:tcMar>
-              <w:top w:type="dxa" w:w="80"/>
-              <w:left w:type="dxa" w:w="100"/>
-              <w:bottom w:type="dxa" w:w="80"/>
-              <w:right w:type="dxa" w:w="100"/>
-            </w:tcMar>
-          </w:tcPr>
-          <w:p>
-            <w:r>
-              <w:rPr>
-                <w:b w:val="false"/>
-                <w:bCs w:val="false"/>
-                <w:sz w:val="19"/>
-                <w:szCs w:val="19"/>
-              </w:rPr>
-              <w:t xml:space="preserve">Qué se hizo semana a semana, y los desafíos superados en el camino.</w:t>
-            </w:r>
-          </w:p>
-        </w:tc>
-      </w:tr>
-      <w:tr>
-        <w:tc>
-          <w:tcPr>
-            <w:tcW w:type="dxa" w:w="1350"/>
-            <w:shd w:fill="E8EEEE" w:color="auto" w:val="clear"/>
-            <w:tcMar>
-              <w:top w:type="dxa" w:w="80"/>
-              <w:left w:type="dxa" w:w="100"/>
-              <w:bottom w:type="dxa" w:w="80"/>
-              <w:right w:type="dxa" w:w="100"/>
-            </w:tcMar>
-          </w:tcPr>
-          <w:p>
-            <w:r>
-              <w:rPr>
-                <w:b w:val="false"/>
-                <w:bCs w:val="false"/>
-                <w:sz w:val="19"/>
-                <w:szCs w:val="19"/>
-              </w:rPr>
-              <w:t xml:space="preserve">Cierre</w:t>
-            </w:r>
-          </w:p>
-        </w:tc>
-        <w:tc>
-          <w:tcPr>
-            <w:tcW w:type="dxa" w:w="1050"/>
-            <w:shd w:fill="E8EEEE" w:color="auto" w:val="clear"/>
-            <w:tcMar>
-              <w:top w:type="dxa" w:w="80"/>
-              <w:left w:type="dxa" w:w="100"/>
-              <w:bottom w:type="dxa" w:w="80"/>
-              <w:right w:type="dxa" w:w="100"/>
-            </w:tcMar>
-          </w:tcPr>
-          <w:p>
-            <w:r>
-              <w:rPr>
-                <w:b w:val="false"/>
-                <w:bCs w:val="false"/>
-                <w:sz w:val="19"/>
-                <w:szCs w:val="19"/>
-              </w:rPr>
-              <w:t xml:space="preserve">0.5 min</w:t>
-            </w:r>
-          </w:p>
-        </w:tc>
-        <w:tc>
-          <w:tcPr>
-            <w:tcW w:type="dxa" w:w="1150"/>
-            <w:shd w:fill="E8EEEE" w:color="auto" w:val="clear"/>
-            <w:tcMar>
-              <w:top w:type="dxa" w:w="80"/>
-              <w:left w:type="dxa" w:w="100"/>
-              <w:bottom w:type="dxa" w:w="80"/>
-              <w:right w:type="dxa" w:w="100"/>
-            </w:tcMar>
-          </w:tcPr>
-          <w:p>
-            <w:r>
-              <w:rPr>
-                <w:b w:val="false"/>
-                <w:bCs w:val="false"/>
-                <w:sz w:val="19"/>
-                <w:szCs w:val="19"/>
-              </w:rPr>
-              <w:t xml:space="preserve">Santiago</w:t>
-            </w:r>
-          </w:p>
-        </w:tc>
-        <w:tc>
-          <w:tcPr>
-            <w:tcW w:type="dxa" w:w="5800"/>
-            <w:shd w:fill="E8EEEE" w:color="auto" w:val="clear"/>
-            <w:tcMar>
-              <w:top w:type="dxa" w:w="80"/>
-              <w:left w:type="dxa" w:w="100"/>
-              <w:bottom w:type="dxa" w:w="80"/>
-              <w:right w:type="dxa" w:w="100"/>
-            </w:tcMar>
-          </w:tcPr>
-          <w:p>
-            <w:r>
-              <w:rPr>
-                <w:b w:val="false"/>
-                <w:bCs w:val="false"/>
-                <w:sz w:val="19"/>
-                <w:szCs w:val="19"/>
-              </w:rPr>
-              <w:t xml:space="preserve">Este bimestre se formuló y se diseñó; el próximo arranca el desarrollo técnico.</w:t>
-            </w:r>
-          </w:p>
-        </w:tc>
-      </w:tr>
-    </w:tbl>
-    <w:p>
-      <w:pPr>
-        <w:pStyle w:val="Heading2"/>
-        <w:spacing w:after="140" w:before="260"/>
-      </w:pPr>
-      <w:r>
-        <w:t xml:space="preserve">Preguntas anticipadas</w:t>
-      </w:r>
-    </w:p>
-    <w:p>
-      <w:pPr>
-        <w:spacing w:after="160"/>
-      </w:pPr>
-      <w:r>
-        <w:t xml:space="preserve">Responde Santiago en la ronda de preguntas, pero los 4 integrantes conocen estas respuestas de memoria.</w:t>
-      </w:r>
-    </w:p>
-    <w:p>
-      <w:pPr>
-        <w:spacing w:after="100"/>
-      </w:pPr>
-      <w:r>
-        <w:rPr>
-          <w:b/>
-          <w:bCs/>
-        </w:rPr>
-        <w:t xml:space="preserve">¿Por qué este problema y no otro? ¿Cómo lo verificaron?</w:t>
-      </w:r>
-    </w:p>
-    <w:p>
-      <w:pPr>
-        <w:spacing w:after="160"/>
-      </w:pPr>
-      <w:r>
-        <w:t xml:space="preserve">Se compararon 10 propuestas; se descartaron 5 por falta de evidencia o por tener ya una solución gratuita instalada. Dermalia quedó porque toda la cadena causal se sostiene con evidencia externa real.</w:t>
-      </w:r>
-    </w:p>
-    <w:p>
-      <w:pPr>
-        <w:spacing w:after="100"/>
-      </w:pPr>
-      <w:r>
-        <w:rPr>
-          <w:b/>
-          <w:bCs/>
-        </w:rPr>
-        <w:t xml:space="preserve">¿Por qué una terminal y no que la paciente reserve desde su celular?</w:t>
-      </w:r>
-    </w:p>
-    <w:p>
-      <w:pPr>
-        <w:spacing w:after="160"/>
-      </w:pPr>
-      <w:r>
-        <w:t xml:space="preserve">El stack real del equipo es C + SQL Server + Qt de escritorio, sin web y sin API externa. Una terminal táctil dentro del instituto sí es Qt nativo.</w:t>
-      </w:r>
-    </w:p>
-    <w:p>
-      <w:pPr>
-        <w:spacing w:after="100"/>
-      </w:pPr>
-      <w:r>
-        <w:rPr>
-          <w:b/>
-          <w:bCs/>
-        </w:rPr>
-        <w:t xml:space="preserve">¿Qué pasa si el supuesto de mayor riesgo no se cumple?</w:t>
-      </w:r>
-    </w:p>
-    <w:p>
-      <w:pPr>
-        <w:spacing w:after="160"/>
-      </w:pPr>
-      <w:r>
-        <w:t xml:space="preserve">El riesgo más alto es que la recepción no adopte el sistema como herramienta principal. Mitigación: capacitación breve al iniciar y transición gradual.</w:t>
-      </w:r>
-    </w:p>
-    <w:p>
-      <w:pPr>
-        <w:spacing w:after="100"/>
-      </w:pPr>
-      <w:r>
-        <w:rPr>
-          <w:b/>
-          <w:bCs/>
-        </w:rPr>
-        <w:t xml:space="preserve">¿Es realizable en el tiempo que tienen, con el equipo que son?</w:t>
-      </w:r>
-    </w:p>
-    <w:p>
-      <w:pPr>
-        <w:spacing w:after="160"/>
-      </w:pPr>
-      <w:r>
-        <w:t xml:space="preserve">Para este bimestre (formulación y diseño), sí: el equipo cuenta 7 semanas reales de trabajo, y las 6 piezas de la Carpeta de Proyecto están cerradas en la Semana 7, la última.</w:t>
-      </w:r>
-    </w:p>
-    <w:p>
-      <w:pPr>
-        <w:spacing w:after="100"/>
-      </w:pPr>
-      <w:r>
-        <w:rPr>
-          <w:b/>
-          <w:bCs/>
-        </w:rPr>
-        <w:t xml:space="preserve">¿Por qué está todo simulado en vez de conectado a un servicio real?</w:t>
-      </w:r>
-    </w:p>
-    <w:p>
-      <w:pPr>
-        <w:spacing w:after="160"/>
-      </w:pPr>
-      <w:r>
-        <w:t xml:space="preserve">Restricción del equipo: backend en C con SQL Server, frontend en Qt de escritorio, sin integraciones por API externa. La lógica de negocio queda igual, solo cambia la implementación.</w:t>
-      </w:r>
-    </w:p>
-    <w:p>
-      <w:pPr>
-        <w:spacing w:after="100"/>
-      </w:pPr>
-      <w:r>
-        <w:rPr>
-          <w:b/>
-          <w:bCs/>
-        </w:rPr>
-        <w:t xml:space="preserve">¿Qué queda afuera del alcance y por qué?</w:t>
-      </w:r>
-    </w:p>
-    <w:p>
-      <w:pPr>
-        <w:spacing w:after="160"/>
-      </w:pPr>
-      <w:r>
-        <w:t xml:space="preserve">Historia clínica, stock de insumos, liquidación de comisiones y app nativa quedaron fuera desde el Árbol de Problemas: no atacan ninguna de las cuatro causas raíz. Este bimestre no se programa nada, se formula y se diseña.</w:t>
+        <w:t xml:space="preserve">Diapositivas</w:t>
+      </w:r>
+    </w:p>
+    <w:p>
+      <w:pPr>
+        <w:pStyle w:val="ListParagraph"/>
+        <w:numPr>
+          <w:ilvl w:val="0"/>
+          <w:numId w:val="1"/>
+        </w:numPr>
+        <w:spacing w:after="80"/>
+      </w:pPr>
+      <w:r>
+        <w:t xml:space="preserve">1. Portada</w:t>
+      </w:r>
+    </w:p>
+    <w:p>
+      <w:pPr>
+        <w:pStyle w:val="ListParagraph"/>
+        <w:numPr>
+          <w:ilvl w:val="0"/>
+          <w:numId w:val="1"/>
+        </w:numPr>
+        <w:spacing w:after="80"/>
+      </w:pPr>
+      <w:r>
+        <w:t xml:space="preserve">2. El problema</w:t>
+      </w:r>
+    </w:p>
+    <w:p>
+      <w:pPr>
+        <w:pStyle w:val="ListParagraph"/>
+        <w:numPr>
+          <w:ilvl w:val="0"/>
+          <w:numId w:val="1"/>
+        </w:numPr>
+        <w:spacing w:after="80"/>
+      </w:pPr>
+      <w:r>
+        <w:t xml:space="preserve">3. Causas de ineficiencia</w:t>
+      </w:r>
+    </w:p>
+    <w:p>
+      <w:pPr>
+        <w:pStyle w:val="ListParagraph"/>
+        <w:numPr>
+          <w:ilvl w:val="0"/>
+          <w:numId w:val="1"/>
+        </w:numPr>
+        <w:spacing w:after="80"/>
+      </w:pPr>
+      <w:r>
+        <w:t xml:space="preserve">4. La propuesta: Dermalia</w:t>
+      </w:r>
+    </w:p>
+    <w:p>
+      <w:pPr>
+        <w:pStyle w:val="ListParagraph"/>
+        <w:numPr>
+          <w:ilvl w:val="0"/>
+          <w:numId w:val="1"/>
+        </w:numPr>
+        <w:spacing w:after="80"/>
+      </w:pPr>
+      <w:r>
+        <w:t xml:space="preserve">5. Cómo funciona</w:t>
+      </w:r>
+    </w:p>
+    <w:p>
+      <w:pPr>
+        <w:pStyle w:val="ListParagraph"/>
+        <w:numPr>
+          <w:ilvl w:val="0"/>
+          <w:numId w:val="1"/>
+        </w:numPr>
+        <w:spacing w:after="80"/>
+      </w:pPr>
+      <w:r>
+        <w:t xml:space="preserve">6. Stack técnico</w:t>
+      </w:r>
+    </w:p>
+    <w:p>
+      <w:pPr>
+        <w:pStyle w:val="ListParagraph"/>
+        <w:numPr>
+          <w:ilvl w:val="0"/>
+          <w:numId w:val="1"/>
+        </w:numPr>
+        <w:spacing w:after="80"/>
+      </w:pPr>
+      <w:r>
+        <w:t xml:space="preserve">7. Éxito</w:t>
+      </w:r>
+    </w:p>
+    <w:p>
+      <w:pPr>
+        <w:pStyle w:val="ListParagraph"/>
+        <w:numPr>
+          <w:ilvl w:val="0"/>
+          <w:numId w:val="1"/>
+        </w:numPr>
+        <w:spacing w:after="80"/>
+      </w:pPr>
+      <w:r>
+        <w:t xml:space="preserve">8. Hitos del proyecto</w:t>
+      </w:r>
+    </w:p>
+    <w:p>
+      <w:pPr>
+        <w:pStyle w:val="ListParagraph"/>
+        <w:numPr>
+          <w:ilvl w:val="0"/>
+          <w:numId w:val="1"/>
+        </w:numPr>
+        <w:spacing w:after="80"/>
+      </w:pPr>
+      <w:r>
+        <w:t xml:space="preserve">9. Desafíos superados</w:t>
+      </w:r>
+    </w:p>
+    <w:p>
+      <w:pPr>
+        <w:pStyle w:val="ListParagraph"/>
+        <w:numPr>
+          <w:ilvl w:val="0"/>
+          <w:numId w:val="1"/>
+        </w:numPr>
+        <w:spacing w:after="80"/>
+      </w:pPr>
+      <w:r>
+        <w:t xml:space="preserve">10. Próximos pasos</w:t>
+      </w:r>
+    </w:p>
+    <w:p>
+      <w:pPr>
+        <w:pStyle w:val="ListParagraph"/>
+        <w:numPr>
+          <w:ilvl w:val="0"/>
+          <w:numId w:val="1"/>
+        </w:numPr>
+        <w:spacing w:after="80"/>
+      </w:pPr>
+      <w:r>
+        <w:t xml:space="preserve">11. Gracias</w:t>
       </w:r>
     </w:p>
     <w:sectPr>

</xml_diff>